<commit_message>
feat(resume): update resume files and remove outdated documents
- Updated `resume.pdf` and `wilsonchow_resume_v4_full-stack.pdf` with new content.
- Deleted `wilsonchowsinlong_resume.pdf` and temporary document `~$lsonchow_resume_v4_full-stack.docx` as they are no longer needed.
- Refined content in `resume-v4-ai.mdx`, `resume-v4-frontend.mdx`, and `resume-v4-full-stack.mdx` for clarity and consistency, emphasizing skills in Generative AI and multi-client environments.
- Improved formatting and structure across all resume documents to enhance readability and presentation.
</commit_message>
<xml_diff>
--- a/apps/web/src/features/resume/wilsonchow_resume_v4_ai.docx
+++ b/apps/web/src/features/resume/wilsonchow_resume_v4_ai.docx
@@ -75,7 +75,7 @@
           <w:color w:val="1A1A1A"/>
           <w:sz w:val="21"/>
         </w:rPr>
-        <w:t xml:space="preserve">Software engineer with 5 years delivering medium-to-large full-stack Node.js initiatives in a fast-paced, multi-client environment. Currently leading a multi-channel Generative AI agent platform with durable workflows, memory, RAG, scorers, and evals. Builds the typed APIs and UIs those agents run through — not a chat-completion wrapper. AWS Solutions Architect Associate.</w:t>
+        <w:t xml:space="preserve">Software engineer with 5 years shipping full-stack Node.js in a multi-client environment. Currently leading a multi-channel Generative AI agent platform with durable workflows, memory, RAG, and evals. Builds the typed APIs and UIs those agents run through. AWS Solutions Architect Associate.</w:t>
       </w:r>
     </w:p>
     <w:p>
@@ -133,7 +133,7 @@
           <w:color w:val="4A4A4A"/>
           <w:sz w:val="20"/>
         </w:rPr>
-        <w:t xml:space="preserve">Primary engineer for concurrent client products, partnering with technical and non-technical stakeholders. Recent work is production Generative AI agents — workflows, memory, tools, and quality gates — on top of typed APIs and AWS.</w:t>
+        <w:t xml:space="preserve">Primary engineer for concurrent client products. Recent work is production Generative AI agents — workflows, memory, tools, and evals — on top of typed APIs and AWS.</w:t>
       </w:r>
     </w:p>
     <w:p>
@@ -149,7 +149,7 @@
           <w:color w:val="1A1A1A"/>
           <w:sz w:val="21"/>
         </w:rPr>
-        <w:t xml:space="preserve">Shipped production AI agents (workflows, memory, tool calls, observability) with Mastra, Vercel AI SDK, and Langchain, including composable chat and tool-invocation UIs.</w:t>
+        <w:t xml:space="preserve">Shipped production AI agents (workflows, memory, tool calls, observability) with Mastra, Vercel AI SDK, and Langchain, including chat and tool-invocation UIs.</w:t>
       </w:r>
     </w:p>
     <w:p>
@@ -165,7 +165,7 @@
           <w:color w:val="1A1A1A"/>
           <w:sz w:val="21"/>
         </w:rPr>
-        <w:t xml:space="preserve">Added scored eval suites (golden prompts + LLM-as-judge) and run/tool traces so prompt or tool changes fail in CI-style checks instead of in front of clients.</w:t>
+        <w:t xml:space="preserve">Added eval suites (golden prompts + LLM-as-judge) and run/tool traces so prompt or tool changes fail before clients see them.</w:t>
       </w:r>
     </w:p>
     <w:p>
@@ -181,7 +181,7 @@
           <w:color w:val="1A1A1A"/>
           <w:sz w:val="21"/>
         </w:rPr>
-        <w:t xml:space="preserve">Built typed Node.js APIs with Hono, Drizzle / Prisma, OpenAPI, and tRPC in a Turborepo, deployed with SST. Dockerized APIs on ECS Fargate; other workloads on Lambda / API Gateway. Familiar with Kubernetes from AWS Solutions Architect study; production containers are Docker on ECS, not self-managed K8s.</w:t>
+        <w:t xml:space="preserve">Built typed Node.js APIs with Hono, Drizzle / Prisma, OpenAPI, and tRPC in a Turborepo, deployed with SST. APIs on ECS Fargate; other workloads on Lambda / API Gateway.</w:t>
       </w:r>
     </w:p>
     <w:p>
@@ -283,7 +283,7 @@
           <w:color w:val="1A1A1A"/>
           <w:sz w:val="21"/>
         </w:rPr>
-        <w:t xml:space="preserve"> production web and mobile apps as medium-to-large initiatives; the agent platform is the current system, not a side demo.</w:t>
+        <w:t xml:space="preserve"> production web and mobile apps; the agent platform is the current system.</w:t>
       </w:r>
     </w:p>
     <w:p>
@@ -389,7 +389,7 @@
           <w:color w:val="1A1A1A"/>
           <w:sz w:val="21"/>
         </w:rPr>
-        <w:t xml:space="preserve">Built workflow, memory, scheduling, and workspace primitives on Mastra and AI SDK: pause/resume, retries, file storage, sandboxed tools, and skills.</w:t>
+        <w:t xml:space="preserve">Built workflows, memory, schedules, and tools on Mastra and AI SDK: pause/resume, retries, file storage, sandboxed tools, and skills.</w:t>
       </w:r>
     </w:p>
     <w:p>
@@ -405,7 +405,7 @@
           <w:color w:val="1A1A1A"/>
           <w:sz w:val="21"/>
         </w:rPr>
-        <w:t xml:space="preserve">Shipped end-to-end RAG: ingest/parse, chunking, Pinecone retrieval with query/rerank (graph query where needed). Retrieval is org-scoped (namespace = organization) so the model cannot search another tenant.</w:t>
+        <w:t xml:space="preserve">Shipped end-to-end RAG: ingest/parse, chunking, Pinecone retrieval with query/rerank. Retrieval is org-scoped so the model cannot search another tenant.</w:t>
       </w:r>
     </w:p>
     <w:p>
@@ -421,7 +421,7 @@
           <w:color w:val="1A1A1A"/>
           <w:sz w:val="21"/>
         </w:rPr>
-        <w:t xml:space="preserve">Added ClickHouse run/tool traces and cost/latency metrics; gated releases on scored evals after prompt or tool changes — diagnosing issues across UI, API, and agent runs.</w:t>
+        <w:t xml:space="preserve">Added ClickHouse run/tool traces and cost/latency metrics; gated releases on evals after prompt or tool changes.</w:t>
       </w:r>
     </w:p>
     <w:p>
@@ -437,7 +437,7 @@
           <w:color w:val="1A1A1A"/>
           <w:sz w:val="21"/>
         </w:rPr>
-        <w:t xml:space="preserve">Ran Dockerized Hono + Better Auth on ECS Fargate, Postgres for core data, S3 for files — so agent state and artifacts outlive a single request.</w:t>
+        <w:t xml:space="preserve">Ran Hono + Better Auth on ECS Fargate, Postgres for core data, S3 for files — so agent state and artifacts outlive a single request.</w:t>
       </w:r>
     </w:p>
     <w:p>
@@ -453,7 +453,7 @@
           <w:color w:val="1A1A1A"/>
           <w:sz w:val="21"/>
         </w:rPr>
-        <w:t xml:space="preserve">Shipped a TipTap @mention file-tagging component so workspace files enter prompts as first-class context, not pasted blobs.</w:t>
+        <w:t xml:space="preserve">Shipped a TipTap @mention file-tagging component so workspace files enter prompts as context.</w:t>
       </w:r>
     </w:p>
     <w:p>
@@ -496,7 +496,7 @@
           <w:color w:val="1A1A1A"/>
           <w:sz w:val="21"/>
         </w:rPr>
-        <w:t xml:space="preserve">Built a custom Strapi plugin for generative AI content creation with AI SDK — generation inside the publish workflow, not a separate chat toy.</w:t>
+        <w:t xml:space="preserve">Built a custom Strapi plugin for generative AI content creation with AI SDK — generation inside the publish workflow.</w:t>
       </w:r>
     </w:p>
     <w:p>
@@ -528,7 +528,7 @@
           <w:color w:val="1A1A1A"/>
           <w:sz w:val="21"/>
         </w:rPr>
-        <w:t xml:space="preserve">Site still had to be a product: </w:t>
+        <w:t xml:space="preserve"/>
       </w:r>
       <w:r>
         <w:rPr>
@@ -755,7 +755,7 @@
           <w:color w:val="1A1A1A"/>
           <w:sz w:val="21"/>
         </w:rPr>
-        <w:t xml:space="preserve">SST, Docker, ECS Fargate, GitHub Actions, AWS (Lambda, API Gateway) · Kubernetes (familiar)</w:t>
+        <w:t xml:space="preserve">SST, Docker, ECS Fargate, GitHub Actions, AWS (Lambda, API Gateway)</w:t>
       </w:r>
     </w:p>
     <w:p>
@@ -880,7 +880,7 @@
           <w:color w:val="1A1A1A"/>
           <w:sz w:val="21"/>
         </w:rPr>
-        <w:t xml:space="preserve">Career switch from pharmacy — a regulated, high-stakes domain — after finding a passion for building apps and systems</w:t>
+        <w:t xml:space="preserve">Passion for building things. Career switch from pharmacy to software development.</w:t>
       </w:r>
     </w:p>
     <w:sectPr>

</xml_diff>